<commit_message>
Update Fuel Usage guide with dynamic database detection section
Co-Authored-By: Claude Opus 4.6 <noreply@anthropic.com>
</commit_message>
<xml_diff>
--- a/Fuel_Usage_AddIn_Setup_Guide.docx
+++ b/Fuel_Usage_AddIn_Setup_Guide.docx
@@ -2921,7 +2921,7 @@
           <w:sz w:val="20"/>
           <w:szCs w:val="20"/>
         </w:rPr>
-        <w:t xml:space="preserve">initialize(api, state, callback) — called once when the add-in first loads. Sets default dates, binds button events, calls callback() to signal ready.</w:t>
+        <w:t xml:space="preserve">initialize(api, state, callback) — called once when the add-in first loads. Detects the database name from the URL, sets default dates, binds button events, calls callback() to signal ready.</w:t>
       </w:r>
     </w:p>
     <w:p>
@@ -2974,7 +2974,63 @@
           <w:sz w:val="26"/>
           <w:szCs w:val="26"/>
         </w:rPr>
-        <w:t xml:space="preserve">6.2 Data Flow</w:t>
+        <w:t xml:space="preserve">6.2 Dynamic Database Detection</w:t>
+      </w:r>
+    </w:p>
+    <w:p>
+      <w:pPr>
+        <w:spacing w:after="120"/>
+      </w:pPr>
+      <w:r>
+        <w:rPr>
+          <w:rFonts w:ascii="Arial" w:cs="Arial" w:eastAsia="Arial" w:hAnsi="Arial"/>
+          <w:sz w:val="20"/>
+          <w:szCs w:val="20"/>
+        </w:rPr>
+        <w:t xml:space="preserve">The add-in automatically detects the current database name from the MyGeotab URL path using the pattern:</w:t>
+      </w:r>
+    </w:p>
+    <w:p>
+      <w:pPr>
+        <w:spacing w:after="40"/>
+      </w:pPr>
+      <w:r>
+        <w:rPr>
+          <w:rFonts w:ascii="Consolas" w:cs="Consolas" w:eastAsia="Consolas" w:hAnsi="Consolas"/>
+          <w:sz w:val="16"/>
+          <w:szCs w:val="16"/>
+        </w:rPr>
+        <w:t xml:space="preserve">window.location.pathname.match(/\/([^\/]+)\//)</w:t>
+      </w:r>
+    </w:p>
+    <w:p>
+      <w:pPr>
+        <w:spacing w:after="120"/>
+      </w:pPr>
+      <w:r>
+        <w:rPr>
+          <w:rFonts w:ascii="Arial" w:cs="Arial" w:eastAsia="Arial" w:hAnsi="Arial"/>
+          <w:sz w:val="20"/>
+          <w:szCs w:val="20"/>
+        </w:rPr>
+        <w:t xml:space="preserve">This extracts the database name (e.g., "Travl", "sasa_inti", "alamui_indonesia") from URLs like https://my.geotab.com/Travl/#addin-... and displays it in the page subtitle. The same detection is used for the CSV export filename, producing files like fuel_usage_per_day_Travl.csv.</w:t>
+      </w:r>
+    </w:p>
+    <w:p>
+      <w:pPr>
+        <w:pStyle w:val="Heading2"/>
+        <w:spacing w:after="160" w:before="280"/>
+      </w:pPr>
+      <w:r>
+        <w:rPr>
+          <w:rFonts w:ascii="Arial" w:cs="Arial" w:eastAsia="Arial" w:hAnsi="Arial"/>
+          <w:b/>
+          <w:bCs/>
+          <w:color w:val="2E75B6"/>
+          <w:sz w:val="26"/>
+          <w:szCs w:val="26"/>
+        </w:rPr>
+        <w:t xml:space="preserve">6.3 Data Flow</w:t>
       </w:r>
     </w:p>
     <w:p>
@@ -3117,7 +3173,7 @@
           <w:sz w:val="26"/>
           <w:szCs w:val="26"/>
         </w:rPr>
-        <w:t xml:space="preserve">6.3 CSV Export</w:t>
+        <w:t xml:space="preserve">6.4 CSV Export</w:t>
       </w:r>
     </w:p>
     <w:p>

</xml_diff>